<commit_message>
Agregar el enlace del repositorio a los documentos de entrega
</commit_message>
<xml_diff>
--- a/entrega/Fase1_Interpretacion_de_datos.docx
+++ b/entrega/Fase1_Interpretacion_de_datos.docx
@@ -148,6 +148,19 @@
           <w:i w:val="0"/>
         </w:rPr>
         <w:t>Sesión 11 · Semana 11 · 24 de octubre de 2026</w:t>
+      </w:r>
+    </w:p>
+    <w:p>
+      <w:pPr>
+        <w:jc w:val="center"/>
+      </w:pPr>
+      <w:r>
+        <w:rPr>
+          <w:b w:val="0"/>
+          <w:i w:val="0"/>
+          <w:sz w:val="20"/>
+        </w:rPr>
+        <w:t>Repositorio: https://github.com/Nicolas0pm/guia9-visualizacion-datos</w:t>
       </w:r>
     </w:p>
     <w:p>
@@ -1752,6 +1765,18 @@
         <w:t>Universidad — Guía de laboratorio N.º 9: Business Analytics e Inteligencia Artificial (2026).</w:t>
       </w:r>
     </w:p>
+    <w:p>
+      <w:pPr>
+        <w:jc w:val="both"/>
+      </w:pPr>
+      <w:r>
+        <w:rPr>
+          <w:b w:val="0"/>
+          <w:i w:val="0"/>
+        </w:rPr>
+        <w:t>Repositorio del proyecto (gráficas, datos y software de la FASE 2): https://github.com/Nicolas0pm/guia9-visualizacion-datos</w:t>
+      </w:r>
+    </w:p>
     <w:sectPr>
       <w:footerReference w:type="default" r:id="rId9"/>
       <w:pgSz w:w="12240" w:h="15840"/>

</xml_diff>